<commit_message>
penambahan aut selection dan ascreenshot artifacts
</commit_message>
<xml_diff>
--- a/14-Github-Action-x-Selenium.docx
+++ b/14-Github-Action-x-Selenium.docx
@@ -638,6 +638,12 @@
               <w:pStyle w:val="ListParagraph"/>
               <w:ind w:left="0"/>
             </w:pPr>
+            <w:r>
+              <w:rPr>
+                <w:lang w:val="en-ID"/>
+              </w:rPr>
+              <w:t>File `.github/workflows/main.yml` digunakan sebagai konfigurasi GitHub Actions untuk menjalankan proses Continuous Integration (CI) secara otomatis pada aplikasi AUT. Workflow ini akan berjalan ketika terdapat perubahan pada branch `main` melalui proses push. Tahap awal workflow melakukan checkout repository menggunakan `actions/checkout@v4` untuk mengambil source code aplikasi ke dalam runner GitHub Actions. Selanjutnya, workflow membuat Docker network bernama `isolated` yang digunakan sebagai penghubung komunikasi antara container AUT dan Selenium. Setelah itu dilakukan proses build Docker image dengan perintah `docker build -t aut2026 .` berdasarkan Dockerfile yang telah dibuat. Image tersebut kemudian dijalankan sebagai container aplikasi menggunakan `docker run` dengan nama `aut-container`. Workflow berikutnya melakukan deployment Selenium container menggunakan image `selenium/standalone-firefox` yang berfungsi sebagai browser automation environment untuk menjalankan pengujian. Setelah Selenium dijalankan, file `wait.sh` digunakan untuk memastikan Selenium WebDriver telah siap menerima koneksi sebelum proses pengujian dimulai. Selanjutnya library Selenium Python diinstal menggunakan `pip install selenium`, kemudian script pengujian otomatis `tests/hello_example.py` dijalankan untuk mengakses aplikasi AUT, melakukan validasi halaman, dan memberikan hasil pengujian. Dengan adanya workflow ini, seluruh proses mulai dari pengambilan kode, pembangunan aplikasi, deployment container, hingga pengujian otomatis dapat berjalan secara terintegrasi dan otomatis melalui GitHub Actions.</w:t>
+            </w:r>
           </w:p>
         </w:tc>
       </w:tr>
@@ -651,16 +657,6 @@
       <w:r>
         <w:br w:type="page"/>
       </w:r>
-    </w:p>
-    <w:p>
-      <w:pPr>
-        <w:pStyle w:val="ListParagraph"/>
-        <w:numPr>
-          <w:ilvl w:val="0"/>
-          <w:numId w:val="9"/>
-        </w:numPr>
-        <w:jc w:val="both"/>
-      </w:pPr>
       <w:r>
         <w:lastRenderedPageBreak/>
         <w:t xml:space="preserve">Lakukan </w:t>
@@ -1090,6 +1086,294 @@
               <w:ind w:left="0"/>
             </w:pPr>
           </w:p>
+          <w:p>
+            <w:pPr>
+              <w:pStyle w:val="ListParagraph"/>
+              <w:ind w:left="0"/>
+            </w:pPr>
+            <w:r>
+              <w:drawing>
+                <wp:anchor distT="0" distB="0" distL="114300" distR="114300" simplePos="0" relativeHeight="251659264" behindDoc="0" locked="0" layoutInCell="1" allowOverlap="1" wp14:anchorId="1E11B8C7" wp14:editId="70B7796D">
+                  <wp:simplePos x="0" y="0"/>
+                  <wp:positionH relativeFrom="column">
+                    <wp:posOffset>460779</wp:posOffset>
+                  </wp:positionH>
+                  <wp:positionV relativeFrom="page">
+                    <wp:posOffset>257810</wp:posOffset>
+                  </wp:positionV>
+                  <wp:extent cx="4227870" cy="2085109"/>
+                  <wp:effectExtent l="0" t="0" r="1270" b="0"/>
+                  <wp:wrapNone/>
+                  <wp:docPr id="1299617515" name="Picture 1"/>
+                  <wp:cNvGraphicFramePr>
+                    <a:graphicFrameLocks xmlns:a="http://schemas.openxmlformats.org/drawingml/2006/main" noChangeAspect="1"/>
+                  </wp:cNvGraphicFramePr>
+                  <a:graphic xmlns:a="http://schemas.openxmlformats.org/drawingml/2006/main">
+                    <a:graphicData uri="http://schemas.openxmlformats.org/drawingml/2006/picture">
+                      <pic:pic xmlns:pic="http://schemas.openxmlformats.org/drawingml/2006/picture">
+                        <pic:nvPicPr>
+                          <pic:cNvPr id="1299617515" name=""/>
+                          <pic:cNvPicPr/>
+                        </pic:nvPicPr>
+                        <pic:blipFill>
+                          <a:blip r:embed="rId15" cstate="print">
+                            <a:extLst>
+                              <a:ext uri="{28A0092B-C50C-407E-A947-70E740481C1C}">
+                                <a14:useLocalDpi xmlns:a14="http://schemas.microsoft.com/office/drawing/2010/main" val="0"/>
+                              </a:ext>
+                            </a:extLst>
+                          </a:blip>
+                          <a:stretch>
+                            <a:fillRect/>
+                          </a:stretch>
+                        </pic:blipFill>
+                        <pic:spPr>
+                          <a:xfrm>
+                            <a:off x="0" y="0"/>
+                            <a:ext cx="4227870" cy="2085109"/>
+                          </a:xfrm>
+                          <a:prstGeom prst="rect">
+                            <a:avLst/>
+                          </a:prstGeom>
+                        </pic:spPr>
+                      </pic:pic>
+                    </a:graphicData>
+                  </a:graphic>
+                  <wp14:sizeRelH relativeFrom="margin">
+                    <wp14:pctWidth>0</wp14:pctWidth>
+                  </wp14:sizeRelH>
+                  <wp14:sizeRelV relativeFrom="margin">
+                    <wp14:pctHeight>0</wp14:pctHeight>
+                  </wp14:sizeRelV>
+                </wp:anchor>
+              </w:drawing>
+            </w:r>
+          </w:p>
+          <w:p>
+            <w:pPr>
+              <w:pStyle w:val="ListParagraph"/>
+              <w:ind w:left="0"/>
+            </w:pPr>
+          </w:p>
+          <w:p>
+            <w:pPr>
+              <w:pStyle w:val="ListParagraph"/>
+              <w:ind w:left="0"/>
+            </w:pPr>
+          </w:p>
+          <w:p>
+            <w:pPr>
+              <w:pStyle w:val="ListParagraph"/>
+              <w:ind w:left="0"/>
+            </w:pPr>
+          </w:p>
+          <w:p>
+            <w:pPr>
+              <w:pStyle w:val="ListParagraph"/>
+              <w:ind w:left="0"/>
+            </w:pPr>
+          </w:p>
+          <w:p>
+            <w:pPr>
+              <w:pStyle w:val="ListParagraph"/>
+              <w:ind w:left="0"/>
+            </w:pPr>
+          </w:p>
+          <w:p>
+            <w:pPr>
+              <w:pStyle w:val="ListParagraph"/>
+              <w:ind w:left="0"/>
+            </w:pPr>
+          </w:p>
+          <w:p>
+            <w:pPr>
+              <w:pStyle w:val="ListParagraph"/>
+              <w:ind w:left="0"/>
+            </w:pPr>
+          </w:p>
+          <w:p>
+            <w:pPr>
+              <w:pStyle w:val="ListParagraph"/>
+              <w:ind w:left="0"/>
+            </w:pPr>
+          </w:p>
+          <w:p>
+            <w:pPr>
+              <w:pStyle w:val="ListParagraph"/>
+              <w:ind w:left="0"/>
+            </w:pPr>
+          </w:p>
+          <w:p>
+            <w:pPr>
+              <w:pStyle w:val="ListParagraph"/>
+              <w:ind w:left="0"/>
+            </w:pPr>
+          </w:p>
+          <w:p>
+            <w:pPr>
+              <w:pStyle w:val="ListParagraph"/>
+              <w:ind w:left="0"/>
+            </w:pPr>
+          </w:p>
+          <w:p>
+            <w:pPr>
+              <w:pStyle w:val="ListParagraph"/>
+              <w:ind w:left="0"/>
+            </w:pPr>
+          </w:p>
+          <w:p>
+            <w:pPr>
+              <w:pStyle w:val="ListParagraph"/>
+              <w:ind w:left="0"/>
+            </w:pPr>
+          </w:p>
+          <w:p>
+            <w:pPr>
+              <w:pStyle w:val="ListParagraph"/>
+              <w:ind w:left="0"/>
+            </w:pPr>
+            <w:r>
+              <w:drawing>
+                <wp:anchor distT="0" distB="0" distL="114300" distR="114300" simplePos="0" relativeHeight="251658240" behindDoc="0" locked="0" layoutInCell="1" allowOverlap="1" wp14:anchorId="2190EF5E" wp14:editId="30B0263B">
+                  <wp:simplePos x="0" y="0"/>
+                  <wp:positionH relativeFrom="column">
+                    <wp:posOffset>343823</wp:posOffset>
+                  </wp:positionH>
+                  <wp:positionV relativeFrom="page">
+                    <wp:posOffset>2661285</wp:posOffset>
+                  </wp:positionV>
+                  <wp:extent cx="4496046" cy="2216727"/>
+                  <wp:effectExtent l="0" t="0" r="0" b="0"/>
+                  <wp:wrapNone/>
+                  <wp:docPr id="1788135992" name="Picture 1"/>
+                  <wp:cNvGraphicFramePr>
+                    <a:graphicFrameLocks xmlns:a="http://schemas.openxmlformats.org/drawingml/2006/main" noChangeAspect="1"/>
+                  </wp:cNvGraphicFramePr>
+                  <a:graphic xmlns:a="http://schemas.openxmlformats.org/drawingml/2006/main">
+                    <a:graphicData uri="http://schemas.openxmlformats.org/drawingml/2006/picture">
+                      <pic:pic xmlns:pic="http://schemas.openxmlformats.org/drawingml/2006/picture">
+                        <pic:nvPicPr>
+                          <pic:cNvPr id="1788135992" name=""/>
+                          <pic:cNvPicPr/>
+                        </pic:nvPicPr>
+                        <pic:blipFill>
+                          <a:blip r:embed="rId16" cstate="print">
+                            <a:extLst>
+                              <a:ext uri="{28A0092B-C50C-407E-A947-70E740481C1C}">
+                                <a14:useLocalDpi xmlns:a14="http://schemas.microsoft.com/office/drawing/2010/main" val="0"/>
+                              </a:ext>
+                            </a:extLst>
+                          </a:blip>
+                          <a:stretch>
+                            <a:fillRect/>
+                          </a:stretch>
+                        </pic:blipFill>
+                        <pic:spPr>
+                          <a:xfrm>
+                            <a:off x="0" y="0"/>
+                            <a:ext cx="4496046" cy="2216727"/>
+                          </a:xfrm>
+                          <a:prstGeom prst="rect">
+                            <a:avLst/>
+                          </a:prstGeom>
+                        </pic:spPr>
+                      </pic:pic>
+                    </a:graphicData>
+                  </a:graphic>
+                  <wp14:sizeRelH relativeFrom="margin">
+                    <wp14:pctWidth>0</wp14:pctWidth>
+                  </wp14:sizeRelH>
+                  <wp14:sizeRelV relativeFrom="margin">
+                    <wp14:pctHeight>0</wp14:pctHeight>
+                  </wp14:sizeRelV>
+                </wp:anchor>
+              </w:drawing>
+            </w:r>
+          </w:p>
+          <w:p>
+            <w:pPr>
+              <w:pStyle w:val="ListParagraph"/>
+              <w:ind w:left="0"/>
+            </w:pPr>
+          </w:p>
+          <w:p>
+            <w:pPr>
+              <w:pStyle w:val="ListParagraph"/>
+              <w:ind w:left="0"/>
+            </w:pPr>
+          </w:p>
+          <w:p>
+            <w:pPr>
+              <w:pStyle w:val="ListParagraph"/>
+              <w:ind w:left="0"/>
+            </w:pPr>
+          </w:p>
+          <w:p>
+            <w:pPr>
+              <w:pStyle w:val="ListParagraph"/>
+              <w:ind w:left="0"/>
+            </w:pPr>
+          </w:p>
+          <w:p>
+            <w:pPr>
+              <w:pStyle w:val="ListParagraph"/>
+              <w:ind w:left="0"/>
+            </w:pPr>
+          </w:p>
+          <w:p>
+            <w:pPr>
+              <w:pStyle w:val="ListParagraph"/>
+              <w:ind w:left="0"/>
+            </w:pPr>
+          </w:p>
+          <w:p>
+            <w:pPr>
+              <w:pStyle w:val="ListParagraph"/>
+              <w:ind w:left="0"/>
+            </w:pPr>
+          </w:p>
+          <w:p>
+            <w:pPr>
+              <w:pStyle w:val="ListParagraph"/>
+              <w:ind w:left="0"/>
+            </w:pPr>
+          </w:p>
+          <w:p>
+            <w:pPr>
+              <w:pStyle w:val="ListParagraph"/>
+              <w:ind w:left="0"/>
+            </w:pPr>
+          </w:p>
+          <w:p>
+            <w:pPr>
+              <w:pStyle w:val="ListParagraph"/>
+              <w:ind w:left="0"/>
+            </w:pPr>
+          </w:p>
+          <w:p>
+            <w:pPr>
+              <w:pStyle w:val="ListParagraph"/>
+              <w:ind w:left="0"/>
+            </w:pPr>
+          </w:p>
+          <w:p>
+            <w:pPr>
+              <w:pStyle w:val="ListParagraph"/>
+              <w:ind w:left="0"/>
+            </w:pPr>
+          </w:p>
+          <w:p>
+            <w:pPr>
+              <w:pStyle w:val="ListParagraph"/>
+              <w:ind w:left="0"/>
+            </w:pPr>
+          </w:p>
+          <w:p>
+            <w:pPr>
+              <w:pStyle w:val="ListParagraph"/>
+              <w:ind w:left="0"/>
+            </w:pPr>
+          </w:p>
         </w:tc>
       </w:tr>
     </w:tbl>
@@ -1111,7 +1395,11 @@
         <w:t>Klik salah satu step untuk melihat detail proses yang terjadi. Pada tampilan di bawah ini ditunjukkan detail dari step “Check AUT Url”. Dari step ini dapat kita ketahui bahwa p</w:t>
       </w:r>
       <w:r>
-        <w:t>roses deployment</w:t>
+        <w:t xml:space="preserve">roses </w:t>
+      </w:r>
+      <w:r>
+        <w:lastRenderedPageBreak/>
+        <w:t>deployment</w:t>
       </w:r>
       <w:r>
         <w:t xml:space="preserve"> telah</w:t>
@@ -1150,7 +1438,7 @@
                     <pic:cNvPicPr/>
                   </pic:nvPicPr>
                   <pic:blipFill>
-                    <a:blip r:embed="rId15"/>
+                    <a:blip r:embed="rId17"/>
                     <a:stretch>
                       <a:fillRect/>
                     </a:stretch>
@@ -1185,7 +1473,6 @@
           <w:iCs/>
           <w:u w:val="single"/>
         </w:rPr>
-        <w:lastRenderedPageBreak/>
         <w:t xml:space="preserve">Deploy </w:t>
       </w:r>
       <w:r>
@@ -1236,7 +1523,7 @@
                     </pic:cNvPicPr>
                   </pic:nvPicPr>
                   <pic:blipFill>
-                    <a:blip r:embed="rId16">
+                    <a:blip r:embed="rId18">
                       <a:extLst>
                         <a:ext uri="{28A0092B-C50C-407E-A947-70E740481C1C}">
                           <a14:useLocalDpi xmlns:a14="http://schemas.microsoft.com/office/drawing/2010/main" val="0"/>
@@ -1307,7 +1594,7 @@
                     <pic:cNvPicPr/>
                   </pic:nvPicPr>
                   <pic:blipFill>
-                    <a:blip r:embed="rId17"/>
+                    <a:blip r:embed="rId19"/>
                     <a:stretch>
                       <a:fillRect/>
                     </a:stretch>
@@ -1364,7 +1651,28 @@
             <w:pPr>
               <w:pStyle w:val="ListParagraph"/>
               <w:ind w:left="0"/>
-            </w:pPr>
+              <w:jc w:val="both"/>
+            </w:pPr>
+            <w:r>
+              <w:lastRenderedPageBreak/>
+              <w:t>Pada file `main.yml`, bagian **Selenium Preparation** digunakan untuk menyiapkan lingkungan pengujian otomatis sebelum proses testing dijalankan. Tahap ini bertujuan memastikan Selenium WebDriver tersedia dan container Selenium Firefox sudah berjalan sehingga script pengujian dapat berkomunikasi dengan browser secara otomatis. Pada bagian ini, workflow melakukan deployment Selenium container menggunakan image `selenium/standalone-firefox` yang telah menyediakan browser Firefox dan Selenium WebDriver pada port `4444`. Container Selenium dihubungkan ke Docker network yang sama dengan container AUT agar dapat mengakses aplikasi yang akan diuji.</w:t>
+            </w:r>
+          </w:p>
+          <w:p>
+            <w:pPr>
+              <w:pStyle w:val="ListParagraph"/>
+              <w:jc w:val="both"/>
+            </w:pPr>
+          </w:p>
+          <w:p>
+            <w:pPr>
+              <w:pStyle w:val="ListParagraph"/>
+              <w:ind w:left="0"/>
+              <w:jc w:val="both"/>
+            </w:pPr>
+            <w:r>
+              <w:t>Sedangkan file **`wait.sh`** digunakan sebagai script pengecekan kesiapan Selenium sebelum pengujian dimulai. Setelah container Selenium dijalankan, proses startup membutuhkan waktu beberapa saat hingga Selenium Hub siap menerima koneksi. Script `wait.sh` melakukan pengecekan secara berulang menggunakan perintah `curl` ke alamat Selenium WebDriver pada port `4444`. Jika Selenium belum siap, script akan memberikan pesan menunggu dan melakukan pengecekan kembali setelah jeda waktu tertentu. Setelah Selenium berhasil memberikan respons, proses workflow akan dilanjutkan ke tahap instalasi library Selenium Python dan menjalankan script pengujian otomatis. Dengan adanya Selenium Preparation dan `wait.sh`, proses pengujian menjadi lebih stabil karena memastikan seluruh komponen pengujian telah siap sebelum test dijalankan.</w:t>
+            </w:r>
           </w:p>
         </w:tc>
       </w:tr>
@@ -1413,7 +1721,7 @@
                     <pic:cNvPicPr/>
                   </pic:nvPicPr>
                   <pic:blipFill>
-                    <a:blip r:embed="rId18"/>
+                    <a:blip r:embed="rId20"/>
                     <a:stretch>
                       <a:fillRect/>
                     </a:stretch>
@@ -1471,7 +1779,11 @@
             <w:pPr>
               <w:pStyle w:val="ListParagraph"/>
               <w:ind w:left="0"/>
-            </w:pPr>
+              <w:jc w:val="both"/>
+            </w:pPr>
+            <w:r>
+              <w:t>File `wait.sh` merupakan script shell yang digunakan untuk melakukan pengecekan kesiapan Selenium WebDriver sebelum proses pengujian otomatis dijalankan. Isi file `wait.sh` terdiri dari perintah `#!/bin/bash` yang menentukan bahwa script akan dijalankan menggunakan Bash Shell. Selanjutnya terdapat perintah `until curl --output /dev/null --silent --head --fail http://localhost:4444; do` yang berfungsi untuk melakukan pengecekan koneksi ke Selenium Server melalui port `4444`. Perintah `curl` digunakan untuk mengirim permintaan ke Selenium WebDriver, sedangkan parameter `--silent`, `--head`, dan `--fail` digunakan agar pengecekan berjalan tanpa menampilkan output yang tidak diperlukan dan hanya memberikan respons ketika Selenium sudah siap. Selama Selenium belum memberikan respons, bagian dalam perulangan akan dijalankan, yaitu menampilkan pesan `Waiting for Selenium Hub...` dan memberikan jeda selama 1 detik menggunakan perintah `sleep 1` sebelum melakukan pengecekan kembali. File `wait.sh` dibutuhkan karena proses startup Selenium container membutuhkan waktu beberapa saat hingga Selenium Hub siap menerima koneksi. Tanpa adanya script ini, GitHub Actions dapat langsung menjalankan Selenium test ketika container Selenium belum sepenuhnya aktif sehingga menyebabkan kegagalan koneksi antara script pengujian dan browser automation. Dengan adanya `wait.sh`, workflow dapat memastikan bahwa Selenium telah siap digunakan terlebih dahulu sehingga proses pengujian otomatis berjalan lebih stabil dan mengurangi kemungkinan error akibat service yang belum tersedia.</w:t>
+            </w:r>
           </w:p>
         </w:tc>
       </w:tr>
@@ -1485,21 +1797,21 @@
         </w:numPr>
       </w:pPr>
       <w:r>
+        <w:t xml:space="preserve">Lakukan commit dan push untuk menyimpan perubahan dan </w:t>
+      </w:r>
+      <w:r>
+        <w:t xml:space="preserve">secara otomatis </w:t>
+      </w:r>
+      <w:r>
+        <w:t>menjalankan Actions.</w:t>
+      </w:r>
+    </w:p>
+    <w:p>
+      <w:pPr>
+        <w:pStyle w:val="ListParagraph"/>
+      </w:pPr>
+      <w:r>
         <w:lastRenderedPageBreak/>
-        <w:t xml:space="preserve">Lakukan commit dan push untuk menyimpan perubahan dan </w:t>
-      </w:r>
-      <w:r>
-        <w:t xml:space="preserve">secara otomatis </w:t>
-      </w:r>
-      <w:r>
-        <w:t>menjalankan Actions.</w:t>
-      </w:r>
-    </w:p>
-    <w:p>
-      <w:pPr>
-        <w:pStyle w:val="ListParagraph"/>
-      </w:pPr>
-      <w:r>
         <w:drawing>
           <wp:inline distT="0" distB="0" distL="0" distR="0" wp14:anchorId="3112764F" wp14:editId="35AECEF1">
             <wp:extent cx="2504364" cy="3088546"/>
@@ -1516,7 +1828,7 @@
                     <pic:cNvPicPr/>
                   </pic:nvPicPr>
                   <pic:blipFill>
-                    <a:blip r:embed="rId19"/>
+                    <a:blip r:embed="rId21"/>
                     <a:stretch>
                       <a:fillRect/>
                     </a:stretch>
@@ -1571,6 +1883,147 @@
               <w:pStyle w:val="ListParagraph"/>
               <w:ind w:left="0"/>
             </w:pPr>
+            <w:r>
+              <w:drawing>
+                <wp:anchor distT="0" distB="0" distL="114300" distR="114300" simplePos="0" relativeHeight="251660288" behindDoc="0" locked="0" layoutInCell="1" allowOverlap="1" wp14:anchorId="2C90AD01" wp14:editId="00329CA5">
+                  <wp:simplePos x="0" y="0"/>
+                  <wp:positionH relativeFrom="column">
+                    <wp:posOffset>198755</wp:posOffset>
+                  </wp:positionH>
+                  <wp:positionV relativeFrom="page">
+                    <wp:posOffset>95654</wp:posOffset>
+                  </wp:positionV>
+                  <wp:extent cx="4745182" cy="2340522"/>
+                  <wp:effectExtent l="0" t="0" r="0" b="3175"/>
+                  <wp:wrapNone/>
+                  <wp:docPr id="1856820433" name="Picture 1"/>
+                  <wp:cNvGraphicFramePr>
+                    <a:graphicFrameLocks xmlns:a="http://schemas.openxmlformats.org/drawingml/2006/main" noChangeAspect="1"/>
+                  </wp:cNvGraphicFramePr>
+                  <a:graphic xmlns:a="http://schemas.openxmlformats.org/drawingml/2006/main">
+                    <a:graphicData uri="http://schemas.openxmlformats.org/drawingml/2006/picture">
+                      <pic:pic xmlns:pic="http://schemas.openxmlformats.org/drawingml/2006/picture">
+                        <pic:nvPicPr>
+                          <pic:cNvPr id="1856820433" name=""/>
+                          <pic:cNvPicPr/>
+                        </pic:nvPicPr>
+                        <pic:blipFill>
+                          <a:blip r:embed="rId22" cstate="print">
+                            <a:extLst>
+                              <a:ext uri="{28A0092B-C50C-407E-A947-70E740481C1C}">
+                                <a14:useLocalDpi xmlns:a14="http://schemas.microsoft.com/office/drawing/2010/main" val="0"/>
+                              </a:ext>
+                            </a:extLst>
+                          </a:blip>
+                          <a:stretch>
+                            <a:fillRect/>
+                          </a:stretch>
+                        </pic:blipFill>
+                        <pic:spPr>
+                          <a:xfrm>
+                            <a:off x="0" y="0"/>
+                            <a:ext cx="4745182" cy="2340522"/>
+                          </a:xfrm>
+                          <a:prstGeom prst="rect">
+                            <a:avLst/>
+                          </a:prstGeom>
+                        </pic:spPr>
+                      </pic:pic>
+                    </a:graphicData>
+                  </a:graphic>
+                  <wp14:sizeRelH relativeFrom="margin">
+                    <wp14:pctWidth>0</wp14:pctWidth>
+                  </wp14:sizeRelH>
+                  <wp14:sizeRelV relativeFrom="margin">
+                    <wp14:pctHeight>0</wp14:pctHeight>
+                  </wp14:sizeRelV>
+                </wp:anchor>
+              </w:drawing>
+            </w:r>
+          </w:p>
+          <w:p>
+            <w:pPr>
+              <w:pStyle w:val="ListParagraph"/>
+              <w:ind w:left="0"/>
+            </w:pPr>
+          </w:p>
+          <w:p>
+            <w:pPr>
+              <w:pStyle w:val="ListParagraph"/>
+              <w:ind w:left="0"/>
+            </w:pPr>
+          </w:p>
+          <w:p>
+            <w:pPr>
+              <w:pStyle w:val="ListParagraph"/>
+              <w:ind w:left="0"/>
+            </w:pPr>
+          </w:p>
+          <w:p>
+            <w:pPr>
+              <w:pStyle w:val="ListParagraph"/>
+              <w:ind w:left="0"/>
+            </w:pPr>
+          </w:p>
+          <w:p>
+            <w:pPr>
+              <w:pStyle w:val="ListParagraph"/>
+              <w:ind w:left="0"/>
+            </w:pPr>
+          </w:p>
+          <w:p>
+            <w:pPr>
+              <w:pStyle w:val="ListParagraph"/>
+              <w:ind w:left="0"/>
+            </w:pPr>
+          </w:p>
+          <w:p>
+            <w:pPr>
+              <w:pStyle w:val="ListParagraph"/>
+              <w:ind w:left="0"/>
+            </w:pPr>
+          </w:p>
+          <w:p>
+            <w:pPr>
+              <w:pStyle w:val="ListParagraph"/>
+              <w:ind w:left="0"/>
+            </w:pPr>
+          </w:p>
+          <w:p>
+            <w:pPr>
+              <w:pStyle w:val="ListParagraph"/>
+              <w:ind w:left="0"/>
+            </w:pPr>
+          </w:p>
+          <w:p>
+            <w:pPr>
+              <w:pStyle w:val="ListParagraph"/>
+              <w:ind w:left="0"/>
+            </w:pPr>
+          </w:p>
+          <w:p>
+            <w:pPr>
+              <w:pStyle w:val="ListParagraph"/>
+              <w:ind w:left="0"/>
+            </w:pPr>
+          </w:p>
+          <w:p>
+            <w:pPr>
+              <w:pStyle w:val="ListParagraph"/>
+              <w:ind w:left="0"/>
+            </w:pPr>
+          </w:p>
+          <w:p>
+            <w:pPr>
+              <w:pStyle w:val="ListParagraph"/>
+              <w:ind w:left="0"/>
+            </w:pPr>
+          </w:p>
+          <w:p>
+            <w:pPr>
+              <w:pStyle w:val="ListParagraph"/>
+              <w:ind w:left="0"/>
+            </w:pPr>
           </w:p>
         </w:tc>
       </w:tr>
@@ -1643,7 +2096,7 @@
                     </pic:cNvPicPr>
                   </pic:nvPicPr>
                   <pic:blipFill>
-                    <a:blip r:embed="rId20">
+                    <a:blip r:embed="rId23">
                       <a:extLst>
                         <a:ext uri="{28A0092B-C50C-407E-A947-70E740481C1C}">
                           <a14:useLocalDpi xmlns:a14="http://schemas.microsoft.com/office/drawing/2010/main" val="0"/>
@@ -1732,7 +2185,7 @@
                     <pic:cNvPicPr/>
                   </pic:nvPicPr>
                   <pic:blipFill>
-                    <a:blip r:embed="rId21"/>
+                    <a:blip r:embed="rId24"/>
                     <a:stretch>
                       <a:fillRect/>
                     </a:stretch>
@@ -1839,7 +2292,7 @@
                     <pic:cNvPicPr/>
                   </pic:nvPicPr>
                   <pic:blipFill>
-                    <a:blip r:embed="rId22"/>
+                    <a:blip r:embed="rId25"/>
                     <a:stretch>
                       <a:fillRect/>
                     </a:stretch>
@@ -1939,7 +2392,7 @@
                     <pic:cNvPicPr/>
                   </pic:nvPicPr>
                   <pic:blipFill>
-                    <a:blip r:embed="rId23"/>
+                    <a:blip r:embed="rId26"/>
                     <a:stretch>
                       <a:fillRect/>
                     </a:stretch>
@@ -2058,7 +2511,7 @@
                     </pic:cNvPicPr>
                   </pic:nvPicPr>
                   <pic:blipFill>
-                    <a:blip r:embed="rId24">
+                    <a:blip r:embed="rId27">
                       <a:extLst>
                         <a:ext uri="{28A0092B-C50C-407E-A947-70E740481C1C}">
                           <a14:useLocalDpi xmlns:a14="http://schemas.microsoft.com/office/drawing/2010/main" val="0"/>
@@ -2129,7 +2582,7 @@
                     <pic:cNvPicPr/>
                   </pic:nvPicPr>
                   <pic:blipFill>
-                    <a:blip r:embed="rId25"/>
+                    <a:blip r:embed="rId28"/>
                     <a:stretch>
                       <a:fillRect/>
                     </a:stretch>
@@ -2242,7 +2695,7 @@
                     <pic:cNvPicPr/>
                   </pic:nvPicPr>
                   <pic:blipFill>
-                    <a:blip r:embed="rId26"/>
+                    <a:blip r:embed="rId29"/>
                     <a:stretch>
                       <a:fillRect/>
                     </a:stretch>
@@ -2342,7 +2795,7 @@
                     <pic:cNvPicPr/>
                   </pic:nvPicPr>
                   <pic:blipFill rotWithShape="1">
-                    <a:blip r:embed="rId27"/>
+                    <a:blip r:embed="rId30"/>
                     <a:srcRect t="11356"/>
                     <a:stretch/>
                   </pic:blipFill>
@@ -2512,7 +2965,7 @@
                     <pic:cNvPicPr/>
                   </pic:nvPicPr>
                   <pic:blipFill>
-                    <a:blip r:embed="rId28"/>
+                    <a:blip r:embed="rId31"/>
                     <a:stretch>
                       <a:fillRect/>
                     </a:stretch>
@@ -2621,7 +3074,7 @@
                     <pic:cNvPicPr/>
                   </pic:nvPicPr>
                   <pic:blipFill>
-                    <a:blip r:embed="rId29"/>
+                    <a:blip r:embed="rId32"/>
                     <a:stretch>
                       <a:fillRect/>
                     </a:stretch>
@@ -2723,7 +3176,7 @@
                     <pic:cNvPicPr/>
                   </pic:nvPicPr>
                   <pic:blipFill>
-                    <a:blip r:embed="rId30"/>
+                    <a:blip r:embed="rId33"/>
                     <a:stretch>
                       <a:fillRect/>
                     </a:stretch>

</xml_diff>